<commit_message>
MAY 19 Update Code
</commit_message>
<xml_diff>
--- a/FS Refundable PaymentReceipt.docx
+++ b/FS Refundable PaymentReceipt.docx
@@ -55,12 +55,12 @@
                     <w:szCs w:val="32"/>
                   </w:rPr>
                   <w:alias w:val="#Nav: /FinalSettlement/CompanyName"/>
-                  <w:tag w:val="#Nav: FS_Refundable_Payment_Receipt/50121"/>
+                  <w:tag w:val="#Nav: FS_Refundable_Payment_Receipt/73209582"/>
                   <w:id w:val="1683855552"/>
                   <w:placeholder>
                     <w:docPart w:val="5EC6594DEA254FD2BF5C46DA2A685602"/>
                   </w:placeholder>
-                  <w:dataBinding w:prefixMappings="xmlns:ns0='urn:microsoft-dynamics-nav/reports/FS_Refundable_Payment_Receipt/50121/'" w:xpath="/ns0:NavWordReportXmlPart[1]/ns0:FinalSettlement[1]/ns0:CompanyName[1]" w:storeItemID="{097411A5-7817-4F41-BE2B-2CFDAB2FA0CA}"/>
+                  <w:dataBinding w:prefixMappings="xmlns:ns0='urn:microsoft-dynamics-nav/reports/FS_Refundable_Payment_Receipt/73209582/'" w:xpath="/ns0:NavWordReportXmlPart[1]/ns0:FinalSettlement[1]/ns0:CompanyName[1]" w:storeItemID="{097411A5-7817-4F41-BE2B-2CFDAB2FA0CA}"/>
                   <w:text/>
                 </w:sdtPr>
                 <w:sdtContent>
@@ -123,12 +123,12 @@
               <w:sdt>
                 <w:sdtPr>
                   <w:alias w:val="#Nav: /FinalSettlement/CompanyAddress"/>
-                  <w:tag w:val="#Nav: FS_Refundable_Payment_Receipt/50121"/>
+                  <w:tag w:val="#Nav: FS_Refundable_Payment_Receipt/73209582"/>
                   <w:id w:val="111030515"/>
                   <w:placeholder>
                     <w:docPart w:val="5EC6594DEA254FD2BF5C46DA2A685602"/>
                   </w:placeholder>
-                  <w:dataBinding w:prefixMappings="xmlns:ns0='urn:microsoft-dynamics-nav/reports/FS_Refundable_Payment_Receipt/50121/'" w:xpath="/ns0:NavWordReportXmlPart[1]/ns0:FinalSettlement[1]/ns0:CompanyAddress[1]" w:storeItemID="{097411A5-7817-4F41-BE2B-2CFDAB2FA0CA}"/>
+                  <w:dataBinding w:prefixMappings="xmlns:ns0='urn:microsoft-dynamics-nav/reports/FS_Refundable_Payment_Receipt/73209582/'" w:xpath="/ns0:NavWordReportXmlPart[1]/ns0:FinalSettlement[1]/ns0:CompanyAddress[1]" w:storeItemID="{097411A5-7817-4F41-BE2B-2CFDAB2FA0CA}"/>
                   <w:text/>
                 </w:sdtPr>
                 <w:sdtContent>
@@ -154,9 +154,9 @@
               <w:sdt>
                 <w:sdtPr>
                   <w:alias w:val="#Nav: /FinalSettlement/CompanyPicture"/>
-                  <w:tag w:val="#Nav: FS_Refundable_Payment_Receipt/50121"/>
+                  <w:tag w:val="#Nav: FS_Refundable_Payment_Receipt/73209582"/>
                   <w:id w:val="-828445407"/>
-                  <w:dataBinding w:prefixMappings="xmlns:ns0='urn:microsoft-dynamics-nav/reports/FS_Refundable_Payment_Receipt/50121/'" w:xpath="/ns0:NavWordReportXmlPart[1]/ns0:FinalSettlement[1]/ns0:CompanyPicture[1]" w:storeItemID="{097411A5-7817-4F41-BE2B-2CFDAB2FA0CA}"/>
+                  <w:dataBinding w:prefixMappings="xmlns:ns0='urn:microsoft-dynamics-nav/reports/FS_Refundable_Payment_Receipt/73209582/'" w:xpath="/ns0:NavWordReportXmlPart[1]/ns0:FinalSettlement[1]/ns0:CompanyPicture[1]" w:storeItemID="{097411A5-7817-4F41-BE2B-2CFDAB2FA0CA}"/>
                   <w:picture/>
                 </w:sdtPr>
                 <w:sdtContent>
@@ -241,12 +241,12 @@
                   <w:sdt>
                     <w:sdtPr>
                       <w:alias w:val="#Nav: /FinalSettlement/CompanyCity"/>
-                      <w:tag w:val="#Nav: FS_Refundable_Payment_Receipt/50121"/>
+                      <w:tag w:val="#Nav: FS_Refundable_Payment_Receipt/73209582"/>
                       <w:id w:val="-1225674795"/>
                       <w:placeholder>
                         <w:docPart w:val="5EC6594DEA254FD2BF5C46DA2A685602"/>
                       </w:placeholder>
-                      <w:dataBinding w:prefixMappings="xmlns:ns0='urn:microsoft-dynamics-nav/reports/FS_Refundable_Payment_Receipt/50121/'" w:xpath="/ns0:NavWordReportXmlPart[1]/ns0:FinalSettlement[1]/ns0:CompanyCity[1]" w:storeItemID="{097411A5-7817-4F41-BE2B-2CFDAB2FA0CA}"/>
+                      <w:dataBinding w:prefixMappings="xmlns:ns0='urn:microsoft-dynamics-nav/reports/FS_Refundable_Payment_Receipt/73209582/'" w:xpath="/ns0:NavWordReportXmlPart[1]/ns0:FinalSettlement[1]/ns0:CompanyCity[1]" w:storeItemID="{097411A5-7817-4F41-BE2B-2CFDAB2FA0CA}"/>
                       <w:text/>
                     </w:sdtPr>
                     <w:sdtContent>
@@ -262,12 +262,12 @@
                   <w:sdt>
                     <w:sdtPr>
                       <w:alias w:val="#Nav: /FinalSettlement/CompanyPostcode"/>
-                      <w:tag w:val="#Nav: FS_Refundable_Payment_Receipt/50121"/>
+                      <w:tag w:val="#Nav: FS_Refundable_Payment_Receipt/73209582"/>
                       <w:id w:val="1626197722"/>
                       <w:placeholder>
                         <w:docPart w:val="5EC6594DEA254FD2BF5C46DA2A685602"/>
                       </w:placeholder>
-                      <w:dataBinding w:prefixMappings="xmlns:ns0='urn:microsoft-dynamics-nav/reports/FS_Refundable_Payment_Receipt/50121/'" w:xpath="/ns0:NavWordReportXmlPart[1]/ns0:FinalSettlement[1]/ns0:CompanyPostcode[1]" w:storeItemID="{097411A5-7817-4F41-BE2B-2CFDAB2FA0CA}"/>
+                      <w:dataBinding w:prefixMappings="xmlns:ns0='urn:microsoft-dynamics-nav/reports/FS_Refundable_Payment_Receipt/73209582/'" w:xpath="/ns0:NavWordReportXmlPart[1]/ns0:FinalSettlement[1]/ns0:CompanyPostcode[1]" w:storeItemID="{097411A5-7817-4F41-BE2B-2CFDAB2FA0CA}"/>
                       <w:text/>
                     </w:sdtPr>
                     <w:sdtContent>
@@ -284,12 +284,12 @@
                   <w:sdt>
                     <w:sdtPr>
                       <w:alias w:val="#Nav: /FinalSettlement/CompanyCountry"/>
-                      <w:tag w:val="#Nav: FS_Refundable_Payment_Receipt/50121"/>
+                      <w:tag w:val="#Nav: FS_Refundable_Payment_Receipt/73209582"/>
                       <w:id w:val="1432628762"/>
                       <w:placeholder>
                         <w:docPart w:val="5EC6594DEA254FD2BF5C46DA2A685602"/>
                       </w:placeholder>
-                      <w:dataBinding w:prefixMappings="xmlns:ns0='urn:microsoft-dynamics-nav/reports/FS_Refundable_Payment_Receipt/50121/'" w:xpath="/ns0:NavWordReportXmlPart[1]/ns0:FinalSettlement[1]/ns0:CompanyCountry[1]" w:storeItemID="{097411A5-7817-4F41-BE2B-2CFDAB2FA0CA}"/>
+                      <w:dataBinding w:prefixMappings="xmlns:ns0='urn:microsoft-dynamics-nav/reports/FS_Refundable_Payment_Receipt/73209582/'" w:xpath="/ns0:NavWordReportXmlPart[1]/ns0:FinalSettlement[1]/ns0:CompanyCountry[1]" w:storeItemID="{097411A5-7817-4F41-BE2B-2CFDAB2FA0CA}"/>
                       <w:text/>
                     </w:sdtPr>
                     <w:sdtContent>
@@ -333,12 +333,12 @@
                   <w:sdt>
                     <w:sdtPr>
                       <w:alias w:val="#Nav: /FinalSettlement/CompanyPhone"/>
-                      <w:tag w:val="#Nav: FS_Refundable_Payment_Receipt/50121"/>
+                      <w:tag w:val="#Nav: FS_Refundable_Payment_Receipt/73209582"/>
                       <w:id w:val="749626762"/>
                       <w:placeholder>
                         <w:docPart w:val="5EC6594DEA254FD2BF5C46DA2A685602"/>
                       </w:placeholder>
-                      <w:dataBinding w:prefixMappings="xmlns:ns0='urn:microsoft-dynamics-nav/reports/FS_Refundable_Payment_Receipt/50121/'" w:xpath="/ns0:NavWordReportXmlPart[1]/ns0:FinalSettlement[1]/ns0:CompanyPhone[1]" w:storeItemID="{097411A5-7817-4F41-BE2B-2CFDAB2FA0CA}"/>
+                      <w:dataBinding w:prefixMappings="xmlns:ns0='urn:microsoft-dynamics-nav/reports/FS_Refundable_Payment_Receipt/73209582/'" w:xpath="/ns0:NavWordReportXmlPart[1]/ns0:FinalSettlement[1]/ns0:CompanyPhone[1]" w:storeItemID="{097411A5-7817-4F41-BE2B-2CFDAB2FA0CA}"/>
                       <w:text/>
                     </w:sdtPr>
                     <w:sdtContent>
@@ -383,12 +383,12 @@
                   <w:sdt>
                     <w:sdtPr>
                       <w:alias w:val="#Nav: /FinalSettlement/CompanyEmail"/>
-                      <w:tag w:val="#Nav: FS_Refundable_Payment_Receipt/50121"/>
+                      <w:tag w:val="#Nav: FS_Refundable_Payment_Receipt/73209582"/>
                       <w:id w:val="1260337084"/>
                       <w:placeholder>
                         <w:docPart w:val="5EC6594DEA254FD2BF5C46DA2A685602"/>
                       </w:placeholder>
-                      <w:dataBinding w:prefixMappings="xmlns:ns0='urn:microsoft-dynamics-nav/reports/FS_Refundable_Payment_Receipt/50121/'" w:xpath="/ns0:NavWordReportXmlPart[1]/ns0:FinalSettlement[1]/ns0:CompanyEmail[1]" w:storeItemID="{097411A5-7817-4F41-BE2B-2CFDAB2FA0CA}"/>
+                      <w:dataBinding w:prefixMappings="xmlns:ns0='urn:microsoft-dynamics-nav/reports/FS_Refundable_Payment_Receipt/73209582/'" w:xpath="/ns0:NavWordReportXmlPart[1]/ns0:FinalSettlement[1]/ns0:CompanyEmail[1]" w:storeItemID="{097411A5-7817-4F41-BE2B-2CFDAB2FA0CA}"/>
                       <w:text/>
                     </w:sdtPr>
                     <w:sdtContent>
@@ -433,12 +433,12 @@
                   <w:sdt>
                     <w:sdtPr>
                       <w:alias w:val="#Nav: /FinalSettlement/CompanyTRN"/>
-                      <w:tag w:val="#Nav: FS_Refundable_Payment_Receipt/50121"/>
+                      <w:tag w:val="#Nav: FS_Refundable_Payment_Receipt/73209582"/>
                       <w:id w:val="-1102098145"/>
                       <w:placeholder>
                         <w:docPart w:val="5EC6594DEA254FD2BF5C46DA2A685602"/>
                       </w:placeholder>
-                      <w:dataBinding w:prefixMappings="xmlns:ns0='urn:microsoft-dynamics-nav/reports/FS_Refundable_Payment_Receipt/50121/'" w:xpath="/ns0:NavWordReportXmlPart[1]/ns0:FinalSettlement[1]/ns0:CompanyTRN[1]" w:storeItemID="{097411A5-7817-4F41-BE2B-2CFDAB2FA0CA}"/>
+                      <w:dataBinding w:prefixMappings="xmlns:ns0='urn:microsoft-dynamics-nav/reports/FS_Refundable_Payment_Receipt/73209582/'" w:xpath="/ns0:NavWordReportXmlPart[1]/ns0:FinalSettlement[1]/ns0:CompanyTRN[1]" w:storeItemID="{097411A5-7817-4F41-BE2B-2CFDAB2FA0CA}"/>
                       <w:text/>
                     </w:sdtPr>
                     <w:sdtContent>
@@ -516,12 +516,12 @@
                   <w:sdt>
                     <w:sdtPr>
                       <w:alias w:val="#Nav: /FinalSettlement/CurrentDate"/>
-                      <w:tag w:val="#Nav: FS_Refundable_Payment_Receipt/50121"/>
+                      <w:tag w:val="#Nav: FS_Refundable_Payment_Receipt/73209582"/>
                       <w:id w:val="-2085441132"/>
                       <w:placeholder>
                         <w:docPart w:val="5EC6594DEA254FD2BF5C46DA2A685602"/>
                       </w:placeholder>
-                      <w:dataBinding w:prefixMappings="xmlns:ns0='urn:microsoft-dynamics-nav/reports/FS_Refundable_Payment_Receipt/50121/'" w:xpath="/ns0:NavWordReportXmlPart[1]/ns0:FinalSettlement[1]/ns0:CurrentDate[1]" w:storeItemID="{097411A5-7817-4F41-BE2B-2CFDAB2FA0CA}"/>
+                      <w:dataBinding w:prefixMappings="xmlns:ns0='urn:microsoft-dynamics-nav/reports/FS_Refundable_Payment_Receipt/73209582/'" w:xpath="/ns0:NavWordReportXmlPart[1]/ns0:FinalSettlement[1]/ns0:CurrentDate[1]" w:storeItemID="{097411A5-7817-4F41-BE2B-2CFDAB2FA0CA}"/>
                       <w:text/>
                     </w:sdtPr>
                     <w:sdtContent>
@@ -600,12 +600,12 @@
               <w:sdt>
                 <w:sdtPr>
                   <w:alias w:val="#Nav: /FinalSettlement/Customer/Name"/>
-                  <w:tag w:val="#Nav: FS_Refundable_Payment_Receipt/50121"/>
+                  <w:tag w:val="#Nav: FS_Refundable_Payment_Receipt/73209582"/>
                   <w:id w:val="-1295215671"/>
                   <w:placeholder>
                     <w:docPart w:val="5EC6594DEA254FD2BF5C46DA2A685602"/>
                   </w:placeholder>
-                  <w:dataBinding w:prefixMappings="xmlns:ns0='urn:microsoft-dynamics-nav/reports/FS_Refundable_Payment_Receipt/50121/'" w:xpath="/ns0:NavWordReportXmlPart[1]/ns0:FinalSettlement[1]/ns0:Customer[1]/ns0:Name[1]" w:storeItemID="{097411A5-7817-4F41-BE2B-2CFDAB2FA0CA}"/>
+                  <w:dataBinding w:prefixMappings="xmlns:ns0='urn:microsoft-dynamics-nav/reports/FS_Refundable_Payment_Receipt/73209582/'" w:xpath="/ns0:NavWordReportXmlPart[1]/ns0:FinalSettlement[1]/ns0:Customer[1]/ns0:Name[1]" w:storeItemID="{097411A5-7817-4F41-BE2B-2CFDAB2FA0CA}"/>
                   <w:text/>
                 </w:sdtPr>
                 <w:sdtContent>
@@ -639,12 +639,12 @@
                   <w:sdt>
                     <w:sdtPr>
                       <w:alias w:val="#Nav: /FinalSettlement/Contract_ID"/>
-                      <w:tag w:val="#Nav: FS_Refundable_Payment_Receipt/50121"/>
+                      <w:tag w:val="#Nav: FS_Refundable_Payment_Receipt/73209582"/>
                       <w:id w:val="2042933386"/>
                       <w:placeholder>
                         <w:docPart w:val="5EC6594DEA254FD2BF5C46DA2A685602"/>
                       </w:placeholder>
-                      <w:dataBinding w:prefixMappings="xmlns:ns0='urn:microsoft-dynamics-nav/reports/FS_Refundable_Payment_Receipt/50121/'" w:xpath="/ns0:NavWordReportXmlPart[1]/ns0:FinalSettlement[1]/ns0:Contract_ID[1]" w:storeItemID="{097411A5-7817-4F41-BE2B-2CFDAB2FA0CA}"/>
+                      <w:dataBinding w:prefixMappings="xmlns:ns0='urn:microsoft-dynamics-nav/reports/FS_Refundable_Payment_Receipt/73209582/'" w:xpath="/ns0:NavWordReportXmlPart[1]/ns0:FinalSettlement[1]/ns0:Contract_ID[1]" w:storeItemID="{097411A5-7817-4F41-BE2B-2CFDAB2FA0CA}"/>
                       <w:text/>
                     </w:sdtPr>
                     <w:sdtContent>
@@ -665,12 +665,12 @@
               <w:sdt>
                 <w:sdtPr>
                   <w:alias w:val="#Nav: /FinalSettlement/Customer/Address"/>
-                  <w:tag w:val="#Nav: FS_Refundable_Payment_Receipt/50121"/>
+                  <w:tag w:val="#Nav: FS_Refundable_Payment_Receipt/73209582"/>
                   <w:id w:val="83123204"/>
                   <w:placeholder>
                     <w:docPart w:val="5EC6594DEA254FD2BF5C46DA2A685602"/>
                   </w:placeholder>
-                  <w:dataBinding w:prefixMappings="xmlns:ns0='urn:microsoft-dynamics-nav/reports/FS_Refundable_Payment_Receipt/50121/'" w:xpath="/ns0:NavWordReportXmlPart[1]/ns0:FinalSettlement[1]/ns0:Customer[1]/ns0:Address[1]" w:storeItemID="{097411A5-7817-4F41-BE2B-2CFDAB2FA0CA}"/>
+                  <w:dataBinding w:prefixMappings="xmlns:ns0='urn:microsoft-dynamics-nav/reports/FS_Refundable_Payment_Receipt/73209582/'" w:xpath="/ns0:NavWordReportXmlPart[1]/ns0:FinalSettlement[1]/ns0:Customer[1]/ns0:Address[1]" w:storeItemID="{097411A5-7817-4F41-BE2B-2CFDAB2FA0CA}"/>
                   <w:text/>
                 </w:sdtPr>
                 <w:sdtContent>
@@ -706,12 +706,12 @@
                   <w:sdt>
                     <w:sdtPr>
                       <w:alias w:val="#Nav: /FinalSettlement/Tenancy_Contract/Property_Name"/>
-                      <w:tag w:val="#Nav: FS_Refundable_Payment_Receipt/50121"/>
+                      <w:tag w:val="#Nav: FS_Refundable_Payment_Receipt/73209582"/>
                       <w:id w:val="1144624482"/>
                       <w:placeholder>
                         <w:docPart w:val="5EC6594DEA254FD2BF5C46DA2A685602"/>
                       </w:placeholder>
-                      <w:dataBinding w:prefixMappings="xmlns:ns0='urn:microsoft-dynamics-nav/reports/FS_Refundable_Payment_Receipt/50121/'" w:xpath="/ns0:NavWordReportXmlPart[1]/ns0:FinalSettlement[1]/ns0:Tenancy_Contract[1]/ns0:Property_Name[1]" w:storeItemID="{097411A5-7817-4F41-BE2B-2CFDAB2FA0CA}"/>
+                      <w:dataBinding w:prefixMappings="xmlns:ns0='urn:microsoft-dynamics-nav/reports/FS_Refundable_Payment_Receipt/73209582/'" w:xpath="/ns0:NavWordReportXmlPart[1]/ns0:FinalSettlement[1]/ns0:Tenancy_Contract[1]/ns0:Property_Name[1]" w:storeItemID="{097411A5-7817-4F41-BE2B-2CFDAB2FA0CA}"/>
                       <w:text/>
                     </w:sdtPr>
                     <w:sdtContent>
@@ -744,12 +744,12 @@
                   <w:sdt>
                     <w:sdtPr>
                       <w:alias w:val="#Nav: /FinalSettlement/Customer/Phone_No_"/>
-                      <w:tag w:val="#Nav: FS_Refundable_Payment_Receipt/50121"/>
+                      <w:tag w:val="#Nav: FS_Refundable_Payment_Receipt/73209582"/>
                       <w:id w:val="71473844"/>
                       <w:placeholder>
                         <w:docPart w:val="5EC6594DEA254FD2BF5C46DA2A685602"/>
                       </w:placeholder>
-                      <w:dataBinding w:prefixMappings="xmlns:ns0='urn:microsoft-dynamics-nav/reports/FS_Refundable_Payment_Receipt/50121/'" w:xpath="/ns0:NavWordReportXmlPart[1]/ns0:FinalSettlement[1]/ns0:Customer[1]/ns0:Phone_No_[1]" w:storeItemID="{097411A5-7817-4F41-BE2B-2CFDAB2FA0CA}"/>
+                      <w:dataBinding w:prefixMappings="xmlns:ns0='urn:microsoft-dynamics-nav/reports/FS_Refundable_Payment_Receipt/73209582/'" w:xpath="/ns0:NavWordReportXmlPart[1]/ns0:FinalSettlement[1]/ns0:Customer[1]/ns0:Phone_No_[1]" w:storeItemID="{097411A5-7817-4F41-BE2B-2CFDAB2FA0CA}"/>
                       <w:text/>
                     </w:sdtPr>
                     <w:sdtContent>
@@ -781,12 +781,12 @@
                   <w:sdt>
                     <w:sdtPr>
                       <w:alias w:val="#Nav: /FinalSettlement/Tenancy_Contract/Unit_Name"/>
-                      <w:tag w:val="#Nav: FS_Refundable_Payment_Receipt/50121"/>
+                      <w:tag w:val="#Nav: FS_Refundable_Payment_Receipt/73209582"/>
                       <w:id w:val="-1769545458"/>
                       <w:placeholder>
                         <w:docPart w:val="5EC6594DEA254FD2BF5C46DA2A685602"/>
                       </w:placeholder>
-                      <w:dataBinding w:prefixMappings="xmlns:ns0='urn:microsoft-dynamics-nav/reports/FS_Refundable_Payment_Receipt/50121/'" w:xpath="/ns0:NavWordReportXmlPart[1]/ns0:FinalSettlement[1]/ns0:Tenancy_Contract[1]/ns0:Unit_Name[1]" w:storeItemID="{097411A5-7817-4F41-BE2B-2CFDAB2FA0CA}"/>
+                      <w:dataBinding w:prefixMappings="xmlns:ns0='urn:microsoft-dynamics-nav/reports/FS_Refundable_Payment_Receipt/73209582/'" w:xpath="/ns0:NavWordReportXmlPart[1]/ns0:FinalSettlement[1]/ns0:Tenancy_Contract[1]/ns0:Unit_Name[1]" w:storeItemID="{097411A5-7817-4F41-BE2B-2CFDAB2FA0CA}"/>
                       <w:text/>
                     </w:sdtPr>
                     <w:sdtContent>
@@ -819,12 +819,12 @@
                   <w:sdt>
                     <w:sdtPr>
                       <w:alias w:val="#Nav: /FinalSettlement/Customer/E_Mail"/>
-                      <w:tag w:val="#Nav: FS_Refundable_Payment_Receipt/50121"/>
+                      <w:tag w:val="#Nav: FS_Refundable_Payment_Receipt/73209582"/>
                       <w:id w:val="1915121569"/>
                       <w:placeholder>
                         <w:docPart w:val="5EC6594DEA254FD2BF5C46DA2A685602"/>
                       </w:placeholder>
-                      <w:dataBinding w:prefixMappings="xmlns:ns0='urn:microsoft-dynamics-nav/reports/FS_Refundable_Payment_Receipt/50121/'" w:xpath="/ns0:NavWordReportXmlPart[1]/ns0:FinalSettlement[1]/ns0:Customer[1]/ns0:E_Mail[1]" w:storeItemID="{097411A5-7817-4F41-BE2B-2CFDAB2FA0CA}"/>
+                      <w:dataBinding w:prefixMappings="xmlns:ns0='urn:microsoft-dynamics-nav/reports/FS_Refundable_Payment_Receipt/73209582/'" w:xpath="/ns0:NavWordReportXmlPart[1]/ns0:FinalSettlement[1]/ns0:Customer[1]/ns0:E_Mail[1]" w:storeItemID="{097411A5-7817-4F41-BE2B-2CFDAB2FA0CA}"/>
                       <w:text/>
                     </w:sdtPr>
                     <w:sdtContent>
@@ -853,12 +853,12 @@
                   <w:sdt>
                     <w:sdtPr>
                       <w:alias w:val="#Nav: /FinalSettlement/Final_Calculation/Contract_Start_Date"/>
-                      <w:tag w:val="#Nav: FS_Refundable_Payment_Receipt/50121"/>
+                      <w:tag w:val="#Nav: FS_Refundable_Payment_Receipt/73209582"/>
                       <w:id w:val="2057197768"/>
                       <w:placeholder>
                         <w:docPart w:val="5EC6594DEA254FD2BF5C46DA2A685602"/>
                       </w:placeholder>
-                      <w:dataBinding w:prefixMappings="xmlns:ns0='urn:microsoft-dynamics-nav/reports/FS_Refundable_Payment_Receipt/50121/'" w:xpath="/ns0:NavWordReportXmlPart[1]/ns0:FinalSettlement[1]/ns0:Final_Calculation[1]/ns0:Contract_Start_Date[1]" w:storeItemID="{097411A5-7817-4F41-BE2B-2CFDAB2FA0CA}"/>
+                      <w:dataBinding w:prefixMappings="xmlns:ns0='urn:microsoft-dynamics-nav/reports/FS_Refundable_Payment_Receipt/73209582/'" w:xpath="/ns0:NavWordReportXmlPart[1]/ns0:FinalSettlement[1]/ns0:Final_Calculation[1]/ns0:Contract_Start_Date[1]" w:storeItemID="{097411A5-7817-4F41-BE2B-2CFDAB2FA0CA}"/>
                       <w:text/>
                     </w:sdtPr>
                     <w:sdtContent>
@@ -875,12 +875,12 @@
                   <w:sdt>
                     <w:sdtPr>
                       <w:alias w:val="#Nav: /FinalSettlement/Final_Calculation/Contract_End_Date"/>
-                      <w:tag w:val="#Nav: FS_Refundable_Payment_Receipt/50121"/>
+                      <w:tag w:val="#Nav: FS_Refundable_Payment_Receipt/73209582"/>
                       <w:id w:val="339737961"/>
                       <w:placeholder>
                         <w:docPart w:val="5EC6594DEA254FD2BF5C46DA2A685602"/>
                       </w:placeholder>
-                      <w:dataBinding w:prefixMappings="xmlns:ns0='urn:microsoft-dynamics-nav/reports/FS_Refundable_Payment_Receipt/50121/'" w:xpath="/ns0:NavWordReportXmlPart[1]/ns0:FinalSettlement[1]/ns0:Final_Calculation[1]/ns0:Contract_End_Date[1]" w:storeItemID="{097411A5-7817-4F41-BE2B-2CFDAB2FA0CA}"/>
+                      <w:dataBinding w:prefixMappings="xmlns:ns0='urn:microsoft-dynamics-nav/reports/FS_Refundable_Payment_Receipt/73209582/'" w:xpath="/ns0:NavWordReportXmlPart[1]/ns0:FinalSettlement[1]/ns0:Final_Calculation[1]/ns0:Contract_End_Date[1]" w:storeItemID="{097411A5-7817-4F41-BE2B-2CFDAB2FA0CA}"/>
                       <w:text/>
                     </w:sdtPr>
                     <w:sdtContent>
@@ -912,12 +912,12 @@
                   <w:sdt>
                     <w:sdtPr>
                       <w:alias w:val="#Nav: /FinalSettlement/Customer/VAT_Registration_No_"/>
-                      <w:tag w:val="#Nav: FS_Refundable_Payment_Receipt/50121"/>
+                      <w:tag w:val="#Nav: FS_Refundable_Payment_Receipt/73209582"/>
                       <w:id w:val="1567451870"/>
                       <w:placeholder>
                         <w:docPart w:val="5EC6594DEA254FD2BF5C46DA2A685602"/>
                       </w:placeholder>
-                      <w:dataBinding w:prefixMappings="xmlns:ns0='urn:microsoft-dynamics-nav/reports/FS_Refundable_Payment_Receipt/50121/'" w:xpath="/ns0:NavWordReportXmlPart[1]/ns0:FinalSettlement[1]/ns0:Customer[1]/ns0:VAT_Registration_No_[1]" w:storeItemID="{097411A5-7817-4F41-BE2B-2CFDAB2FA0CA}"/>
+                      <w:dataBinding w:prefixMappings="xmlns:ns0='urn:microsoft-dynamics-nav/reports/FS_Refundable_Payment_Receipt/73209582/'" w:xpath="/ns0:NavWordReportXmlPart[1]/ns0:FinalSettlement[1]/ns0:Customer[1]/ns0:VAT_Registration_No_[1]" w:storeItemID="{097411A5-7817-4F41-BE2B-2CFDAB2FA0CA}"/>
                       <w:text/>
                     </w:sdtPr>
                     <w:sdtContent>
@@ -948,12 +948,12 @@
                   <w:sdt>
                     <w:sdtPr>
                       <w:alias w:val="#Nav: /FinalSettlement/Tenancy_Contract/Contract_Tenor"/>
-                      <w:tag w:val="#Nav: FS_Refundable_Payment_Receipt/50121"/>
+                      <w:tag w:val="#Nav: FS_Refundable_Payment_Receipt/73209582"/>
                       <w:id w:val="-53392253"/>
                       <w:placeholder>
                         <w:docPart w:val="5EC6594DEA254FD2BF5C46DA2A685602"/>
                       </w:placeholder>
-                      <w:dataBinding w:prefixMappings="xmlns:ns0='urn:microsoft-dynamics-nav/reports/FS_Refundable_Payment_Receipt/50121/'" w:xpath="/ns0:NavWordReportXmlPart[1]/ns0:FinalSettlement[1]/ns0:Tenancy_Contract[1]/ns0:Contract_Tenor[1]" w:storeItemID="{097411A5-7817-4F41-BE2B-2CFDAB2FA0CA}"/>
+                      <w:dataBinding w:prefixMappings="xmlns:ns0='urn:microsoft-dynamics-nav/reports/FS_Refundable_Payment_Receipt/73209582/'" w:xpath="/ns0:NavWordReportXmlPart[1]/ns0:FinalSettlement[1]/ns0:Tenancy_Contract[1]/ns0:Contract_Tenor[1]" w:storeItemID="{097411A5-7817-4F41-BE2B-2CFDAB2FA0CA}"/>
                       <w:text/>
                     </w:sdtPr>
                     <w:sdtContent>
@@ -1133,12 +1133,12 @@
                         <w:szCs w:val="24"/>
                       </w:rPr>
                       <w:alias w:val="#Nav: /FinalSettlement/Contract_ID"/>
-                      <w:tag w:val="#Nav: FS_Refundable_Payment_Receipt/50121"/>
+                      <w:tag w:val="#Nav: FS_Refundable_Payment_Receipt/73209582"/>
                       <w:id w:val="-1501491100"/>
                       <w:placeholder>
                         <w:docPart w:val="998F476B07654CE7BE116F28141E6F6A"/>
                       </w:placeholder>
-                      <w:dataBinding w:prefixMappings="xmlns:ns0='urn:microsoft-dynamics-nav/reports/FS_Refundable_Payment_Receipt/50121/'" w:xpath="/ns0:NavWordReportXmlPart[1]/ns0:FinalSettlement[1]/ns0:Contract_ID[1]" w:storeItemID="{097411A5-7817-4F41-BE2B-2CFDAB2FA0CA}"/>
+                      <w:dataBinding w:prefixMappings="xmlns:ns0='urn:microsoft-dynamics-nav/reports/FS_Refundable_Payment_Receipt/73209582/'" w:xpath="/ns0:NavWordReportXmlPart[1]/ns0:FinalSettlement[1]/ns0:Contract_ID[1]" w:storeItemID="{097411A5-7817-4F41-BE2B-2CFDAB2FA0CA}"/>
                       <w:text/>
                     </w:sdtPr>
                     <w:sdtContent>
@@ -1158,12 +1158,12 @@
               <w:sdt>
                 <w:sdtPr>
                   <w:alias w:val="#Nav: /FinalSettlement/Payment_mode"/>
-                  <w:tag w:val="#Nav: FS_Refundable_Payment_Receipt/50121"/>
+                  <w:tag w:val="#Nav: FS_Refundable_Payment_Receipt/73209582"/>
                   <w:id w:val="283770026"/>
                   <w:placeholder>
                     <w:docPart w:val="998F476B07654CE7BE116F28141E6F6A"/>
                   </w:placeholder>
-                  <w:dataBinding w:prefixMappings="xmlns:ns0='urn:microsoft-dynamics-nav/reports/FS_Refundable_Payment_Receipt/50121/'" w:xpath="/ns0:NavWordReportXmlPart[1]/ns0:FinalSettlement[1]/ns0:Payment_mode[1]" w:storeItemID="{097411A5-7817-4F41-BE2B-2CFDAB2FA0CA}"/>
+                  <w:dataBinding w:prefixMappings="xmlns:ns0='urn:microsoft-dynamics-nav/reports/FS_Refundable_Payment_Receipt/73209582/'" w:xpath="/ns0:NavWordReportXmlPart[1]/ns0:FinalSettlement[1]/ns0:Payment_mode[1]" w:storeItemID="{097411A5-7817-4F41-BE2B-2CFDAB2FA0CA}"/>
                   <w:text/>
                 </w:sdtPr>
                 <w:sdtContent>
@@ -1184,12 +1184,12 @@
               <w:sdt>
                 <w:sdtPr>
                   <w:alias w:val="#Nav: /FinalSettlement/Cheque_No_"/>
-                  <w:tag w:val="#Nav: FS_Refundable_Payment_Receipt/50121"/>
+                  <w:tag w:val="#Nav: FS_Refundable_Payment_Receipt/73209582"/>
                   <w:id w:val="-642585388"/>
                   <w:placeholder>
                     <w:docPart w:val="998F476B07654CE7BE116F28141E6F6A"/>
                   </w:placeholder>
-                  <w:dataBinding w:prefixMappings="xmlns:ns0='urn:microsoft-dynamics-nav/reports/FS_Refundable_Payment_Receipt/50121/'" w:xpath="/ns0:NavWordReportXmlPart[1]/ns0:FinalSettlement[1]/ns0:Cheque_No_[1]" w:storeItemID="{097411A5-7817-4F41-BE2B-2CFDAB2FA0CA}"/>
+                  <w:dataBinding w:prefixMappings="xmlns:ns0='urn:microsoft-dynamics-nav/reports/FS_Refundable_Payment_Receipt/73209582/'" w:xpath="/ns0:NavWordReportXmlPart[1]/ns0:FinalSettlement[1]/ns0:Cheque_No_[1]" w:storeItemID="{097411A5-7817-4F41-BE2B-2CFDAB2FA0CA}"/>
                   <w:text/>
                 </w:sdtPr>
                 <w:sdtContent>
@@ -1213,12 +1213,12 @@
               <w:sdt>
                 <w:sdtPr>
                   <w:alias w:val="#Nav: /FinalSettlement/Total_Amount"/>
-                  <w:tag w:val="#Nav: FS_Refundable_Payment_Receipt/50121"/>
+                  <w:tag w:val="#Nav: FS_Refundable_Payment_Receipt/73209582"/>
                   <w:id w:val="789866209"/>
                   <w:placeholder>
                     <w:docPart w:val="998F476B07654CE7BE116F28141E6F6A"/>
                   </w:placeholder>
-                  <w:dataBinding w:prefixMappings="xmlns:ns0='urn:microsoft-dynamics-nav/reports/FS_Refundable_Payment_Receipt/50121/'" w:xpath="/ns0:NavWordReportXmlPart[1]/ns0:FinalSettlement[1]/ns0:Total_Amount[1]" w:storeItemID="{097411A5-7817-4F41-BE2B-2CFDAB2FA0CA}"/>
+                  <w:dataBinding w:prefixMappings="xmlns:ns0='urn:microsoft-dynamics-nav/reports/FS_Refundable_Payment_Receipt/73209582/'" w:xpath="/ns0:NavWordReportXmlPart[1]/ns0:FinalSettlement[1]/ns0:Total_Amount[1]" w:storeItemID="{097411A5-7817-4F41-BE2B-2CFDAB2FA0CA}"/>
                   <w:text/>
                 </w:sdtPr>
                 <w:sdtContent>
@@ -1267,12 +1267,12 @@
                 <w:sdt>
                   <w:sdtPr>
                     <w:alias w:val="#Nav: /FinalSettlement/Final_Settlement_Words"/>
-                    <w:tag w:val="#Nav: FS_Refundable_Payment_Receipt/50121"/>
+                    <w:tag w:val="#Nav: FS_Refundable_Payment_Receipt/73209582"/>
                     <w:id w:val="1551651119"/>
                     <w:placeholder>
                       <w:docPart w:val="5EC6594DEA254FD2BF5C46DA2A685602"/>
                     </w:placeholder>
-                    <w:dataBinding w:prefixMappings="xmlns:ns0='urn:microsoft-dynamics-nav/reports/FS_Refundable_Payment_Receipt/50121/'" w:xpath="/ns0:NavWordReportXmlPart[1]/ns0:FinalSettlement[1]/ns0:Final_Settlement_Words[1]" w:storeItemID="{097411A5-7817-4F41-BE2B-2CFDAB2FA0CA}"/>
+                    <w:dataBinding w:prefixMappings="xmlns:ns0='urn:microsoft-dynamics-nav/reports/FS_Refundable_Payment_Receipt/73209582/'" w:xpath="/ns0:NavWordReportXmlPart[1]/ns0:FinalSettlement[1]/ns0:Final_Settlement_Words[1]" w:storeItemID="{097411A5-7817-4F41-BE2B-2CFDAB2FA0CA}"/>
                     <w:text/>
                   </w:sdtPr>
                   <w:sdtContent>
@@ -2674,7 +2674,7 @@
 
 <file path=customXml/item3.xml>��< ? x m l   v e r s i o n = " 1 . 0 "   e n c o d i n g = " u t f - 1 6 " ? >   
- < N a v W o r d R e p o r t X m l P a r t   x m l n s = " u r n : m i c r o s o f t - d y n a m i c s - n a v / r e p o r t s / F S _ R e f u n d a b l e _ P a y m e n t _ R e c e i p t / 5 0 1 2 1 / " > + < N a v W o r d R e p o r t X m l P a r t   x m l n s = " u r n : m i c r o s o f t - d y n a m i c s - n a v / r e p o r t s / F S _ R e f u n d a b l e _ P a y m e n t _ R e c e i p t / 7 3 2 0 9 5 8 2 / " >   
      < B C R e p o r t I n f o r m a t i o n >   
@@ -2811,7 +2811,7 @@
 
 <file path=customXml/item4.xml>��< ? x m l   v e r s i o n = " 1 . 0 "   e n c o d i n g = " u t f - 1 6 " ? >   
- < N a v W o r d R e p o r t X m l P a r t   x m l n s = " u r n : m i c r o s o f t - d y n a m i c s - b u s i n e s s c e n t r a l / i n t e r n a l / e x t e n d e d / r e p o r t s / F S _ R e f u n d a b l e _ P a y m e n t _ R e c e i p t / 5 0 1 2 1 / " > + < N a v W o r d R e p o r t X m l P a r t   x m l n s = " u r n : m i c r o s o f t - d y n a m i c s - b u s i n e s s c e n t r a l / i n t e r n a l / e x t e n d e d / r e p o r t s / F S _ R e f u n d a b l e _ P a y m e n t _ R e c e i p t / 7 3 2 0 9 5 8 2 / " >   
      < B C R e p o r t I n f o r m a t i o n >   

</xml_diff>